<commit_message>
Proposal and docs: library computer, 3 room LEDs on one pin, 220 ohm
- Users search on a library computer already joined to the ESP8266
  Wi-Fi, not on their own devices
- Room light is 3 white LEDs in parallel on one output pin (M13)
- LED resistors are 220 ohm (15 total); drop jumper wires from list
- Redraw diagram, rebuild proposal docx/pdf
- Add proposal_src/ with the generator scripts and diagram
</commit_message>
<xml_diff>
--- a/Proposal_SmartLibrary_updated.docx
+++ b/Proposal_SmartLibrary_updated.docx
@@ -54,7 +54,7 @@
           <w:szCs w:val="28"/>
           <w:cs/>
         </w:rPr>
-        <w:t>ฉบับปรับปรุงตามชิ้นงานจริง (27 ตุลาคม 2569)</w:t>
+        <w:t>ฉบับปรับปรุงตามชิ้นงานจริง (28 ตุลาคม 2569)</w:t>
       </w:r>
     </w:p>
     <w:p>
@@ -301,7 +301,7 @@
           <w:rFonts w:ascii="TH Sarabun New" w:hAnsi="TH Sarabun New" w:cs="TH Sarabun New"/>
           <w:cs/>
         </w:rPr>
-        <w:t xml:space="preserve">และเว็บไซต์ และช่วยค้นหาหนังสือผ่านเว็บไซต์ที่บอกโซนและชั้น พร้อมเปิดไฟที่โซนและชั้นของหนังสือ ผู้ใช้เปิดเว็บไซต์ได้จากมือถือหรือคอมพิวเตอร์ผ่าน </w:t>
+        <w:t xml:space="preserve">และเว็บไซต์ และช่วยค้นหาหนังสือผ่านเว็บไซต์ที่บอกโซนและชั้น พร้อมเปิดไฟที่โซนและชั้นของหนังสือ ผู้ใช้ค้นหาหนังสือผ่านคอมพิวเตอร์ของห้องสมุดที่เชื่อมต่อกับ </w:t>
       </w:r>
       <w:r>
         <w:rPr>
@@ -676,7 +676,7 @@
         </w:rPr>
         <w:t>•</w:t>
         <w:tab/>
-        <w:t>ไฟห้องเป็น LED สีขาว 1 ดวง (เดิมวางแผนไว้ 3 ดวง) เลือกโหมดได้ทั้งจากเว็บและปุ่มกดบนบอร์ด โหมด Auto ทำงานตาม LDR และโหมด Manual เปิด-ปิดด้วยปุ่มกดบนบอร์ดหรือผ่านเว็บ</w:t>
+        <w:t>ไฟห้องเป็น LED สีขาว 3 ดวง เปิด-ปิดพร้อมกันด้วยขาควบคุมเพียงขาเดียว เลือกโหมดได้ทั้งจากเว็บและปุ่มกดบนบอร์ด โหมด Auto ทำงานตาม LDR และโหมด Manual เปิด-ปิดด้วยปุ่มกดบนบอร์ดหรือผ่านเว็บ</w:t>
       </w:r>
     </w:p>
     <w:p>
@@ -784,312 +784,7 @@
         </w:rPr>
         <w:t>•</w:t>
         <w:tab/>
-        <w:t>ตรรกะควบคุมทั้งหมดอยู่ใน FPGA โมดูล ESP8266 ทำหน้าที่เป็นเว็บเซิร์ฟเวอร์ เก็บรายการหนังสือ และส่งต่อคำสั่งจากเว็บให้บอร์ด 1 เท่านั้น</w:t>
-      </w:r>
-    </w:p>
-    <w:p>
-      <w:pPr>
-        <w:keepNext/>
-        <w:spacing w:before="240" w:after="80"/>
-        <w:jc w:val="left"/>
-      </w:pPr>
-      <w:r>
-        <w:rPr>
-          <w:rFonts w:ascii="TH Sarabun New" w:hAnsi="TH Sarabun New" w:cs="TH Sarabun New"/>
-          <w:b/>
-          <w:bCs/>
-          <w:sz w:val="36"/>
-          <w:szCs w:val="36"/>
-          <w:cs/>
-        </w:rPr>
-        <w:t>อุปกรณ์ที่ใช้ในการทำโครงงาน</w:t>
-      </w:r>
-    </w:p>
-    <w:p>
-      <w:pPr>
-        <w:tabs>
-          <w:tab w:pos="6520" w:val="left"/>
-        </w:tabs>
-        <w:spacing w:after="20"/>
-        <w:ind w:left="709"/>
-      </w:pPr>
-      <w:r>
-        <w:rPr>
-          <w:rFonts w:ascii="TH Sarabun New" w:hAnsi="TH Sarabun New" w:cs="TH Sarabun New"/>
-        </w:rPr>
-        <w:t>- บอร์ด FPGA EDGE Spartan 7</w:t>
-        <w:tab/>
-        <w:t>2 บอร์ด</w:t>
-      </w:r>
-    </w:p>
-    <w:p>
-      <w:pPr>
-        <w:tabs>
-          <w:tab w:pos="6520" w:val="left"/>
-        </w:tabs>
-        <w:spacing w:after="20"/>
-        <w:ind w:left="709"/>
-      </w:pPr>
-      <w:r>
-        <w:rPr>
-          <w:rFonts w:ascii="TH Sarabun New" w:hAnsi="TH Sarabun New" w:cs="TH Sarabun New"/>
-        </w:rPr>
-        <w:t>- โมดูลเซนเซอร์ควัน MQ-2</w:t>
-        <w:tab/>
-        <w:t>1 ตัว</w:t>
-      </w:r>
-    </w:p>
-    <w:p>
-      <w:pPr>
-        <w:tabs>
-          <w:tab w:pos="6520" w:val="left"/>
-        </w:tabs>
-        <w:spacing w:after="20"/>
-        <w:ind w:left="709"/>
-      </w:pPr>
-      <w:r>
-        <w:rPr>
-          <w:rFonts w:ascii="TH Sarabun New" w:hAnsi="TH Sarabun New" w:cs="TH Sarabun New"/>
-        </w:rPr>
-        <w:t>- พัดลม DC ขนาดเล็ก พร้อมวงจรขับ</w:t>
-        <w:tab/>
-        <w:t>1 ชุด</w:t>
-      </w:r>
-    </w:p>
-    <w:p>
-      <w:pPr>
-        <w:tabs>
-          <w:tab w:pos="6520" w:val="left"/>
-        </w:tabs>
-        <w:spacing w:after="20"/>
-        <w:ind w:left="709"/>
-      </w:pPr>
-      <w:r>
-        <w:rPr>
-          <w:rFonts w:ascii="TH Sarabun New" w:hAnsi="TH Sarabun New" w:cs="TH Sarabun New"/>
-        </w:rPr>
-        <w:t>- LED สีขาว (ไฟห้อง)</w:t>
-        <w:tab/>
-        <w:t>1 ดวง</w:t>
-      </w:r>
-    </w:p>
-    <w:p>
-      <w:pPr>
-        <w:tabs>
-          <w:tab w:pos="6520" w:val="left"/>
-        </w:tabs>
-        <w:spacing w:after="20"/>
-        <w:ind w:left="709"/>
-      </w:pPr>
-      <w:r>
-        <w:rPr>
-          <w:rFonts w:ascii="TH Sarabun New" w:hAnsi="TH Sarabun New" w:cs="TH Sarabun New"/>
-        </w:rPr>
-        <w:t>- LED ไฟโซน สีแดง น้ำเงิน เขียว</w:t>
-        <w:tab/>
-        <w:t>3 ดวง</w:t>
-      </w:r>
-    </w:p>
-    <w:p>
-      <w:pPr>
-        <w:tabs>
-          <w:tab w:pos="6520" w:val="left"/>
-        </w:tabs>
-        <w:spacing w:after="20"/>
-        <w:ind w:left="709"/>
-      </w:pPr>
-      <w:r>
-        <w:rPr>
-          <w:rFonts w:ascii="TH Sarabun New" w:hAnsi="TH Sarabun New" w:cs="TH Sarabun New"/>
-        </w:rPr>
-        <w:t>- LED ไฟชั้น สีแดง น้ำเงิน เหลือง*</w:t>
-        <w:tab/>
-        <w:t>9 ดวง</w:t>
-      </w:r>
-    </w:p>
-    <w:p>
-      <w:pPr>
-        <w:tabs>
-          <w:tab w:pos="6520" w:val="left"/>
-        </w:tabs>
-        <w:spacing w:after="20"/>
-        <w:ind w:left="709"/>
-      </w:pPr>
-      <w:r>
-        <w:rPr>
-          <w:rFonts w:ascii="TH Sarabun New" w:hAnsi="TH Sarabun New" w:cs="TH Sarabun New"/>
-        </w:rPr>
-        <w:t>- ตัวต้านทาน 330 Ω สำหรับ LED</w:t>
-        <w:tab/>
-        <w:t>13 ตัว</w:t>
-      </w:r>
-    </w:p>
-    <w:p>
-      <w:pPr>
-        <w:tabs>
-          <w:tab w:pos="6520" w:val="left"/>
-        </w:tabs>
-        <w:spacing w:after="20"/>
-        <w:ind w:left="709"/>
-      </w:pPr>
-      <w:r>
-        <w:rPr>
-          <w:rFonts w:ascii="TH Sarabun New" w:hAnsi="TH Sarabun New" w:cs="TH Sarabun New"/>
-        </w:rPr>
-        <w:t>- สมาร์ทโฟนหรือคอมพิวเตอร์ (เปิดเว็บ)</w:t>
-        <w:tab/>
-        <w:t>1 เครื่อง</w:t>
-      </w:r>
-    </w:p>
-    <w:p>
-      <w:pPr>
-        <w:tabs>
-          <w:tab w:pos="6520" w:val="left"/>
-        </w:tabs>
-        <w:spacing w:after="20"/>
-        <w:ind w:left="709"/>
-      </w:pPr>
-      <w:r>
-        <w:rPr>
-          <w:rFonts w:ascii="TH Sarabun New" w:hAnsi="TH Sarabun New" w:cs="TH Sarabun New"/>
-        </w:rPr>
-        <w:t>- สายไฟจัมเปอร์</w:t>
-        <w:tab/>
-        <w:t>1 ชุด</w:t>
-      </w:r>
-    </w:p>
-    <w:p>
-      <w:pPr>
-        <w:tabs>
-          <w:tab w:pos="6520" w:val="left"/>
-        </w:tabs>
-        <w:spacing w:after="20"/>
-        <w:ind w:left="709"/>
-      </w:pPr>
-      <w:r>
-        <w:rPr>
-          <w:rFonts w:ascii="TH Sarabun New" w:hAnsi="TH Sarabun New" w:cs="TH Sarabun New"/>
-        </w:rPr>
-        <w:t>- โมเดลห้องสมุดจำลอง</w:t>
-        <w:tab/>
-        <w:t>1 ชุด</w:t>
-      </w:r>
-    </w:p>
-    <w:p>
-      <w:pPr>
-        <w:keepNext w:val="0"/>
-        <w:spacing w:before="0" w:after="80"/>
-        <w:ind w:left="709"/>
-        <w:jc w:val="left"/>
-      </w:pPr>
-      <w:r>
-        <w:rPr>
-          <w:rFonts w:ascii="TH Sarabun New" w:hAnsi="TH Sarabun New" w:cs="TH Sarabun New"/>
-          <w:i/>
-          <w:iCs/>
-          <w:sz w:val="28"/>
-          <w:szCs w:val="28"/>
-          <w:cs/>
-        </w:rPr>
-        <w:t xml:space="preserve">* ชั้นสีเขียวใช้ </w:t>
-      </w:r>
-      <w:r>
-        <w:rPr>
-          <w:rFonts w:ascii="TH Sarabun New" w:hAnsi="TH Sarabun New" w:cs="TH Sarabun New"/>
-          <w:i/>
-          <w:sz w:val="28"/>
-          <w:szCs w:val="28"/>
-        </w:rPr>
-        <w:t xml:space="preserve">LED </w:t>
-      </w:r>
-      <w:r>
-        <w:rPr>
-          <w:rFonts w:ascii="TH Sarabun New" w:hAnsi="TH Sarabun New" w:cs="TH Sarabun New"/>
-          <w:i/>
-          <w:iCs/>
-          <w:sz w:val="28"/>
-          <w:szCs w:val="28"/>
-          <w:cs/>
-        </w:rPr>
-        <w:t xml:space="preserve">สีเหลืองแทน </w:t>
-      </w:r>
-      <w:r>
-        <w:rPr>
-          <w:rFonts w:ascii="TH Sarabun New" w:hAnsi="TH Sarabun New" w:cs="TH Sarabun New"/>
-          <w:i/>
-          <w:sz w:val="28"/>
-          <w:szCs w:val="28"/>
-        </w:rPr>
-        <w:t xml:space="preserve">LED </w:t>
-      </w:r>
-      <w:r>
-        <w:rPr>
-          <w:rFonts w:ascii="TH Sarabun New" w:hAnsi="TH Sarabun New" w:cs="TH Sarabun New"/>
-          <w:i/>
-          <w:iCs/>
-          <w:sz w:val="28"/>
-          <w:szCs w:val="28"/>
-          <w:cs/>
-        </w:rPr>
-        <w:t xml:space="preserve">สีเขียว เพื่อให้สว่างและมองเห็นชัดขึ้น ส่วนไฟโซนสีเขียวยังใช้ </w:t>
-      </w:r>
-      <w:r>
-        <w:rPr>
-          <w:rFonts w:ascii="TH Sarabun New" w:hAnsi="TH Sarabun New" w:cs="TH Sarabun New"/>
-          <w:i/>
-          <w:sz w:val="28"/>
-          <w:szCs w:val="28"/>
-        </w:rPr>
-        <w:t xml:space="preserve">LED </w:t>
-      </w:r>
-      <w:r>
-        <w:rPr>
-          <w:rFonts w:ascii="TH Sarabun New" w:hAnsi="TH Sarabun New" w:cs="TH Sarabun New"/>
-          <w:i/>
-          <w:iCs/>
-          <w:sz w:val="28"/>
-          <w:szCs w:val="28"/>
-          <w:cs/>
-        </w:rPr>
-        <w:t xml:space="preserve">สีเขียวเหมือนเดิม</w:t>
-      </w:r>
-    </w:p>
-    <w:p>
-      <w:pPr>
-        <w:keepNext/>
-        <w:spacing w:before="120" w:after="40"/>
-        <w:jc w:val="left"/>
-      </w:pPr>
-      <w:r>
-        <w:rPr>
-          <w:rFonts w:ascii="TH Sarabun New" w:hAnsi="TH Sarabun New" w:cs="TH Sarabun New"/>
-          <w:b/>
-          <w:bCs/>
-          <w:sz w:val="34"/>
-          <w:szCs w:val="34"/>
-          <w:cs/>
-        </w:rPr>
-        <w:t xml:space="preserve">อุปกรณ์บนบอร์ด </w:t>
-      </w:r>
-      <w:r>
-        <w:rPr>
-          <w:rFonts w:ascii="TH Sarabun New" w:hAnsi="TH Sarabun New" w:cs="TH Sarabun New"/>
-          <w:b/>
-          <w:sz w:val="34"/>
-          <w:szCs w:val="34"/>
-        </w:rPr>
-        <w:t xml:space="preserve">FPGA </w:t>
-      </w:r>
-      <w:r>
-        <w:rPr>
-          <w:rFonts w:ascii="TH Sarabun New" w:hAnsi="TH Sarabun New" w:cs="TH Sarabun New"/>
-          <w:b/>
-          <w:bCs/>
-          <w:sz w:val="34"/>
-          <w:szCs w:val="34"/>
-          <w:cs/>
-        </w:rPr>
-        <w:t xml:space="preserve">ที่ใช้</w:t>
+        <w:t>ผู้ใช้เข้าเว็บผ่านคอมพิวเตอร์ของห้องสมุดที่วางไว้และเชื่อมต่อ Wi-Fi ของ ESP8266 ไว้แล้ว ไม่ได้ให้ผู้ใช้เปิดเว็บจากอุปกรณ์ของตนเอง</w:t>
       </w:r>
     </w:p>
     <w:p>
@@ -1107,7 +802,295 @@
         </w:rPr>
         <w:t>•</w:t>
         <w:tab/>
-        <w:t>สวิตช์เลื่อน 3 ตัว ตั้งจำนวนที่นั่งที่มีคนเป็นเลขฐานสอง 0–7</w:t>
+        <w:t>ตรรกะควบคุมทั้งหมดอยู่ใน FPGA โมดูล ESP8266 ทำหน้าที่เป็นเว็บเซิร์ฟเวอร์ เก็บรายการหนังสือ และส่งต่อคำสั่งจากเว็บให้บอร์ด 1 เท่านั้น</w:t>
+      </w:r>
+    </w:p>
+    <w:p>
+      <w:pPr>
+        <w:keepNext/>
+        <w:spacing w:before="240" w:after="80"/>
+        <w:jc w:val="left"/>
+      </w:pPr>
+      <w:r>
+        <w:rPr>
+          <w:rFonts w:ascii="TH Sarabun New" w:hAnsi="TH Sarabun New" w:cs="TH Sarabun New"/>
+          <w:b/>
+          <w:bCs/>
+          <w:sz w:val="36"/>
+          <w:szCs w:val="36"/>
+          <w:cs/>
+        </w:rPr>
+        <w:t>อุปกรณ์ที่ใช้ในการทำโครงงาน</w:t>
+      </w:r>
+    </w:p>
+    <w:p>
+      <w:pPr>
+        <w:tabs>
+          <w:tab w:pos="6520" w:val="left"/>
+        </w:tabs>
+        <w:spacing w:after="20"/>
+        <w:ind w:left="709"/>
+      </w:pPr>
+      <w:r>
+        <w:rPr>
+          <w:rFonts w:ascii="TH Sarabun New" w:hAnsi="TH Sarabun New" w:cs="TH Sarabun New"/>
+        </w:rPr>
+        <w:t>- บอร์ด FPGA EDGE Spartan 7</w:t>
+        <w:tab/>
+        <w:t>2 บอร์ด</w:t>
+      </w:r>
+    </w:p>
+    <w:p>
+      <w:pPr>
+        <w:tabs>
+          <w:tab w:pos="6520" w:val="left"/>
+        </w:tabs>
+        <w:spacing w:after="20"/>
+        <w:ind w:left="709"/>
+      </w:pPr>
+      <w:r>
+        <w:rPr>
+          <w:rFonts w:ascii="TH Sarabun New" w:hAnsi="TH Sarabun New" w:cs="TH Sarabun New"/>
+        </w:rPr>
+        <w:t>- โมดูลเซนเซอร์ควัน MQ-2</w:t>
+        <w:tab/>
+        <w:t>1 ตัว</w:t>
+      </w:r>
+    </w:p>
+    <w:p>
+      <w:pPr>
+        <w:tabs>
+          <w:tab w:pos="6520" w:val="left"/>
+        </w:tabs>
+        <w:spacing w:after="20"/>
+        <w:ind w:left="709"/>
+      </w:pPr>
+      <w:r>
+        <w:rPr>
+          <w:rFonts w:ascii="TH Sarabun New" w:hAnsi="TH Sarabun New" w:cs="TH Sarabun New"/>
+        </w:rPr>
+        <w:t>- พัดลม DC ขนาดเล็ก พร้อมวงจรขับ</w:t>
+        <w:tab/>
+        <w:t>1 ชุด</w:t>
+      </w:r>
+    </w:p>
+    <w:p>
+      <w:pPr>
+        <w:tabs>
+          <w:tab w:pos="6520" w:val="left"/>
+        </w:tabs>
+        <w:spacing w:after="20"/>
+        <w:ind w:left="709"/>
+      </w:pPr>
+      <w:r>
+        <w:rPr>
+          <w:rFonts w:ascii="TH Sarabun New" w:hAnsi="TH Sarabun New" w:cs="TH Sarabun New"/>
+        </w:rPr>
+        <w:t>- LED สีขาว (ไฟห้อง)</w:t>
+        <w:tab/>
+        <w:t>3 ดวง</w:t>
+      </w:r>
+    </w:p>
+    <w:p>
+      <w:pPr>
+        <w:tabs>
+          <w:tab w:pos="6520" w:val="left"/>
+        </w:tabs>
+        <w:spacing w:after="20"/>
+        <w:ind w:left="709"/>
+      </w:pPr>
+      <w:r>
+        <w:rPr>
+          <w:rFonts w:ascii="TH Sarabun New" w:hAnsi="TH Sarabun New" w:cs="TH Sarabun New"/>
+        </w:rPr>
+        <w:t>- LED ไฟโซน สีแดง น้ำเงิน เขียว</w:t>
+        <w:tab/>
+        <w:t>3 ดวง</w:t>
+      </w:r>
+    </w:p>
+    <w:p>
+      <w:pPr>
+        <w:tabs>
+          <w:tab w:pos="6520" w:val="left"/>
+        </w:tabs>
+        <w:spacing w:after="20"/>
+        <w:ind w:left="709"/>
+      </w:pPr>
+      <w:r>
+        <w:rPr>
+          <w:rFonts w:ascii="TH Sarabun New" w:hAnsi="TH Sarabun New" w:cs="TH Sarabun New"/>
+        </w:rPr>
+        <w:t>- LED ไฟชั้น สีแดง น้ำเงิน เหลือง*</w:t>
+        <w:tab/>
+        <w:t>9 ดวง</w:t>
+      </w:r>
+    </w:p>
+    <w:p>
+      <w:pPr>
+        <w:tabs>
+          <w:tab w:pos="6520" w:val="left"/>
+        </w:tabs>
+        <w:spacing w:after="20"/>
+        <w:ind w:left="709"/>
+      </w:pPr>
+      <w:r>
+        <w:rPr>
+          <w:rFonts w:ascii="TH Sarabun New" w:hAnsi="TH Sarabun New" w:cs="TH Sarabun New"/>
+        </w:rPr>
+        <w:t>- ตัวต้านทาน 220 Ω สำหรับ LED</w:t>
+        <w:tab/>
+        <w:t>15 ตัว</w:t>
+      </w:r>
+    </w:p>
+    <w:p>
+      <w:pPr>
+        <w:tabs>
+          <w:tab w:pos="6520" w:val="left"/>
+        </w:tabs>
+        <w:spacing w:after="20"/>
+        <w:ind w:left="709"/>
+      </w:pPr>
+      <w:r>
+        <w:rPr>
+          <w:rFonts w:ascii="TH Sarabun New" w:hAnsi="TH Sarabun New" w:cs="TH Sarabun New"/>
+        </w:rPr>
+        <w:t>- คอมพิวเตอร์ของห้องสมุด (เปิดเว็บค้นหาหนังสือ)</w:t>
+        <w:tab/>
+        <w:t>1 เครื่อง</w:t>
+      </w:r>
+    </w:p>
+    <w:p>
+      <w:pPr>
+        <w:tabs>
+          <w:tab w:pos="6520" w:val="left"/>
+        </w:tabs>
+        <w:spacing w:after="20"/>
+        <w:ind w:left="709"/>
+      </w:pPr>
+      <w:r>
+        <w:rPr>
+          <w:rFonts w:ascii="TH Sarabun New" w:hAnsi="TH Sarabun New" w:cs="TH Sarabun New"/>
+        </w:rPr>
+        <w:t>- โมเดลห้องสมุดจำลอง</w:t>
+        <w:tab/>
+        <w:t>1 ชุด</w:t>
+      </w:r>
+    </w:p>
+    <w:p>
+      <w:pPr>
+        <w:keepNext w:val="0"/>
+        <w:spacing w:before="0" w:after="80"/>
+        <w:ind w:left="709"/>
+        <w:jc w:val="left"/>
+      </w:pPr>
+      <w:r>
+        <w:rPr>
+          <w:rFonts w:ascii="TH Sarabun New" w:hAnsi="TH Sarabun New" w:cs="TH Sarabun New"/>
+          <w:i/>
+          <w:iCs/>
+          <w:sz w:val="28"/>
+          <w:szCs w:val="28"/>
+          <w:cs/>
+        </w:rPr>
+        <w:t xml:space="preserve">* ชั้นสีเขียวใช้ </w:t>
+      </w:r>
+      <w:r>
+        <w:rPr>
+          <w:rFonts w:ascii="TH Sarabun New" w:hAnsi="TH Sarabun New" w:cs="TH Sarabun New"/>
+          <w:i/>
+          <w:sz w:val="28"/>
+          <w:szCs w:val="28"/>
+        </w:rPr>
+        <w:t xml:space="preserve">LED </w:t>
+      </w:r>
+      <w:r>
+        <w:rPr>
+          <w:rFonts w:ascii="TH Sarabun New" w:hAnsi="TH Sarabun New" w:cs="TH Sarabun New"/>
+          <w:i/>
+          <w:iCs/>
+          <w:sz w:val="28"/>
+          <w:szCs w:val="28"/>
+          <w:cs/>
+        </w:rPr>
+        <w:t xml:space="preserve">สีเหลืองแทน </w:t>
+      </w:r>
+      <w:r>
+        <w:rPr>
+          <w:rFonts w:ascii="TH Sarabun New" w:hAnsi="TH Sarabun New" w:cs="TH Sarabun New"/>
+          <w:i/>
+          <w:sz w:val="28"/>
+          <w:szCs w:val="28"/>
+        </w:rPr>
+        <w:t xml:space="preserve">LED </w:t>
+      </w:r>
+      <w:r>
+        <w:rPr>
+          <w:rFonts w:ascii="TH Sarabun New" w:hAnsi="TH Sarabun New" w:cs="TH Sarabun New"/>
+          <w:i/>
+          <w:iCs/>
+          <w:sz w:val="28"/>
+          <w:szCs w:val="28"/>
+          <w:cs/>
+        </w:rPr>
+        <w:t xml:space="preserve">สีเขียว เพื่อให้สว่างและมองเห็นชัดขึ้น ส่วนไฟโซนสีเขียวยังใช้ </w:t>
+      </w:r>
+      <w:r>
+        <w:rPr>
+          <w:rFonts w:ascii="TH Sarabun New" w:hAnsi="TH Sarabun New" w:cs="TH Sarabun New"/>
+          <w:i/>
+          <w:sz w:val="28"/>
+          <w:szCs w:val="28"/>
+        </w:rPr>
+        <w:t xml:space="preserve">LED </w:t>
+      </w:r>
+      <w:r>
+        <w:rPr>
+          <w:rFonts w:ascii="TH Sarabun New" w:hAnsi="TH Sarabun New" w:cs="TH Sarabun New"/>
+          <w:i/>
+          <w:iCs/>
+          <w:sz w:val="28"/>
+          <w:szCs w:val="28"/>
+          <w:cs/>
+        </w:rPr>
+        <w:t xml:space="preserve">สีเขียวเหมือนเดิม</w:t>
+      </w:r>
+    </w:p>
+    <w:p>
+      <w:pPr>
+        <w:keepNext/>
+        <w:spacing w:before="120" w:after="40"/>
+        <w:jc w:val="left"/>
+      </w:pPr>
+      <w:r>
+        <w:rPr>
+          <w:rFonts w:ascii="TH Sarabun New" w:hAnsi="TH Sarabun New" w:cs="TH Sarabun New"/>
+          <w:b/>
+          <w:bCs/>
+          <w:sz w:val="34"/>
+          <w:szCs w:val="34"/>
+          <w:cs/>
+        </w:rPr>
+        <w:t xml:space="preserve">อุปกรณ์บนบอร์ด </w:t>
+      </w:r>
+      <w:r>
+        <w:rPr>
+          <w:rFonts w:ascii="TH Sarabun New" w:hAnsi="TH Sarabun New" w:cs="TH Sarabun New"/>
+          <w:b/>
+          <w:sz w:val="34"/>
+          <w:szCs w:val="34"/>
+        </w:rPr>
+        <w:t xml:space="preserve">FPGA </w:t>
+      </w:r>
+      <w:r>
+        <w:rPr>
+          <w:rFonts w:ascii="TH Sarabun New" w:hAnsi="TH Sarabun New" w:cs="TH Sarabun New"/>
+          <w:b/>
+          <w:bCs/>
+          <w:sz w:val="34"/>
+          <w:szCs w:val="34"/>
+          <w:cs/>
+        </w:rPr>
+        <w:t xml:space="preserve">ที่ใช้</w:t>
       </w:r>
     </w:p>
     <w:p>
@@ -1125,7 +1108,7 @@
         </w:rPr>
         <w:t>•</w:t>
         <w:tab/>
-        <w:t>สวิตช์เลื่อนเพิ่มเติม สำหรับเลือกค่าที่แสดงบน 7-segment ทดสอบ buzzer และสลับโหมดอัปโหลดโปรแกรม ESP8266</w:t>
+        <w:t>สวิตช์เลื่อน 3 ตัว ตั้งจำนวนที่นั่งที่มีคนเป็นเลขฐานสอง 0–7</w:t>
       </w:r>
     </w:p>
     <w:p>
@@ -1143,7 +1126,7 @@
         </w:rPr>
         <w:t>•</w:t>
         <w:tab/>
-        <w:t>ปุ่มกด 3 ปุ่ม สำหรับเปิด-ปิดไฟในโหมด Manual เปิด-ปิดพัดลม และสลับโหมดไฟ Auto / Manual</w:t>
+        <w:t>สวิตช์เลื่อนเพิ่มเติม สำหรับเลือกค่าที่แสดงบน 7-segment ทดสอบ buzzer และสลับโหมดอัปโหลดโปรแกรม ESP8266</w:t>
       </w:r>
     </w:p>
     <w:p>
@@ -1161,7 +1144,7 @@
         </w:rPr>
         <w:t>•</w:t>
         <w:tab/>
-        <w:t>LDR และเซนเซอร์อุณหภูมิ LM35 ซึ่งอ่านค่าผ่าน ADC MCP3208</w:t>
+        <w:t>ปุ่มกด 3 ปุ่ม สำหรับเปิด-ปิดไฟในโหมด Manual เปิด-ปิดพัดลม และสลับโหมดไฟ Auto / Manual</w:t>
       </w:r>
     </w:p>
     <w:p>
@@ -1179,7 +1162,7 @@
         </w:rPr>
         <w:t>•</w:t>
         <w:tab/>
-        <w:t>7-segment 4 หลัก สำหรับแสดงอุณหภูมิแอร์ (บอร์ด 1) และตำแหน่งโซน-ชั้น (บอร์ด 2)</w:t>
+        <w:t>LDR และเซนเซอร์อุณหภูมิ LM35 ซึ่งอ่านค่าผ่าน ADC MCP3208</w:t>
       </w:r>
     </w:p>
     <w:p>
@@ -1197,7 +1180,7 @@
         </w:rPr>
         <w:t>•</w:t>
         <w:tab/>
-        <w:t>จอ LCD 16×2 สำหรับแสดงจำนวนที่นั่งว่างและไม่ว่าง</w:t>
+        <w:t>7-segment 4 หลัก สำหรับแสดงอุณหภูมิแอร์ (บอร์ด 1) และตำแหน่งโซน-ชั้น (บอร์ด 2)</w:t>
       </w:r>
     </w:p>
     <w:p>
@@ -1215,7 +1198,7 @@
         </w:rPr>
         <w:t>•</w:t>
         <w:tab/>
-        <w:t>Buzzer สำหรับเสียงเตือนควันและเพลงเมื่อมีการค้นหาหนังสือ</w:t>
+        <w:t>จอ LCD 16×2 สำหรับแสดงจำนวนที่นั่งว่างและไม่ว่าง</w:t>
       </w:r>
     </w:p>
     <w:p>
@@ -1233,7 +1216,7 @@
         </w:rPr>
         <w:t>•</w:t>
         <w:tab/>
-        <w:t>โมดูล Wi-Fi ESP8266 สำหรับเชื่อมเว็บไซต์กับบอร์ด 1</w:t>
+        <w:t>Buzzer สำหรับเสียงเตือนควันและเพลงเมื่อมีการค้นหาหนังสือ</w:t>
       </w:r>
     </w:p>
     <w:p>
@@ -1251,6 +1234,24 @@
         </w:rPr>
         <w:t>•</w:t>
         <w:tab/>
+        <w:t>โมดูล Wi-Fi ESP8266 สำหรับเชื่อมเว็บไซต์กับบอร์ด 1</w:t>
+      </w:r>
+    </w:p>
+    <w:p>
+      <w:pPr>
+        <w:tabs>
+          <w:tab w:pos="1077" w:val="left"/>
+        </w:tabs>
+        <w:spacing w:after="40"/>
+        <w:ind w:left="1077" w:hanging="369"/>
+        <w:jc w:val="left"/>
+      </w:pPr>
+      <w:r>
+        <w:rPr>
+          <w:rFonts w:ascii="TH Sarabun New" w:hAnsi="TH Sarabun New" w:cs="TH Sarabun New"/>
+        </w:rPr>
+        <w:t>•</w:t>
+        <w:tab/>
         <w:t>USB-UART สำหรับอัปโหลดโปรแกรมลง ESP8266</w:t>
       </w:r>
     </w:p>
@@ -1296,7 +1297,33 @@
           <w:rFonts w:ascii="TH Sarabun New" w:hAnsi="TH Sarabun New" w:cs="TH Sarabun New"/>
           <w:cs/>
         </w:rPr>
-        <w:t xml:space="preserve">บอร์ด และมือถือหรือคอมพิวเตอร์ที่เปิดเว็บไซต์ บอร์ด 1 รับอินพุตและสั่งเอาต์พุตของระบบไฟ ระบบแอร์และพัดลม ระบบเตือนควัน และระบบที่นั่ง โมดูล </w:t>
+        <w:t xml:space="preserve">บอร์ด และคอมพิวเตอร์ของห้องสมุดที่เชื่อมต่อ </w:t>
+      </w:r>
+      <w:r>
+        <w:rPr>
+          <w:rFonts w:ascii="TH Sarabun New" w:hAnsi="TH Sarabun New" w:cs="TH Sarabun New"/>
+        </w:rPr>
+        <w:t xml:space="preserve">Wi-Fi </w:t>
+      </w:r>
+      <w:r>
+        <w:rPr>
+          <w:rFonts w:ascii="TH Sarabun New" w:hAnsi="TH Sarabun New" w:cs="TH Sarabun New"/>
+          <w:cs/>
+        </w:rPr>
+        <w:t xml:space="preserve">ของ </w:t>
+      </w:r>
+      <w:r>
+        <w:rPr>
+          <w:rFonts w:ascii="TH Sarabun New" w:hAnsi="TH Sarabun New" w:cs="TH Sarabun New"/>
+        </w:rPr>
+        <w:t xml:space="preserve">ESP8266 </w:t>
+      </w:r>
+      <w:r>
+        <w:rPr>
+          <w:rFonts w:ascii="TH Sarabun New" w:hAnsi="TH Sarabun New" w:cs="TH Sarabun New"/>
+          <w:cs/>
+        </w:rPr>
+        <w:t xml:space="preserve">ไว้สำหรับให้ผู้ใช้เปิดเว็บไซต์ บอร์ด 1 รับอินพุตและสั่งเอาต์พุตของระบบไฟ ระบบแอร์และพัดลม ระบบเตือนควัน และระบบที่นั่ง โมดูล </w:t>
       </w:r>
       <w:r>
         <w:rPr>
@@ -1427,7 +1454,7 @@
           <w:rFonts w:ascii="TH Sarabun New" w:hAnsi="TH Sarabun New" w:cs="TH Sarabun New"/>
           <w:cs/>
         </w:rPr>
-        <w:t xml:space="preserve">สีขาว 1 ดวง ผู้ใช้เลือกโหมดได้จากเว็บหรือกดปุ่มสลับโหมดบนบอร์ด ในโหมด </w:t>
+        <w:t xml:space="preserve">สีขาว 3 ดวง ต่อขนานกันและควบคุมด้วยขาเอาต์พุตเพียงขาเดียว จึงเปิด-ปิดพร้อมกันทั้ง 3 ดวง ผู้ใช้เลือกโหมดได้จากเว็บหรือกดปุ่มสลับโหมดบนบอร์ด ในโหมด </w:t>
       </w:r>
       <w:r>
         <w:rPr>
@@ -1665,7 +1692,7 @@
           <w:rFonts w:ascii="TH Sarabun New" w:hAnsi="TH Sarabun New" w:cs="TH Sarabun New"/>
           <w:cs/>
         </w:rPr>
-        <w:t xml:space="preserve">ระบบช่วยหาหนังสือ ผู้ใช้เปิดเว็บแล้วจะเห็นรายการหนังสือทั้งหมดพร้อมจำนวนคงเหลือ เมื่อพิมพ์ชื่อหนังสือ เว็บจะกรองเหลือเฉพาะเล่มที่ตรง เมื่อกด </w:t>
+        <w:t xml:space="preserve">ระบบช่วยหาหนังสือ ผู้ใช้ใช้คอมพิวเตอร์ของห้องสมุดเปิดเว็บแล้วจะเห็นรายการหนังสือทั้งหมดพร้อมจำนวนคงเหลือ เมื่อพิมพ์ชื่อหนังสือ เว็บจะกรองเหลือเฉพาะเล่มที่ตรง เมื่อกด </w:t>
       </w:r>
       <w:r>
         <w:rPr>
@@ -4532,7 +4559,7 @@
         </w:rPr>
         <w:t>1.</w:t>
         <w:tab/>
-        <w:t>เว็บไซต์ย้ายจากคอมพิวเตอร์ที่ต่อสาย USB-UART มาอยู่บนโมดูล Wi-Fi ESP8266 บนบอร์ด 1 ผู้ใช้เปิดเว็บจากมือถือหรือคอมพิวเตอร์ผ่าน Wi-Fi ได้</w:t>
+        <w:t>เว็บไซต์ย้ายมาอยู่บนโมดูล Wi-Fi ESP8266 บนบอร์ด 1 คอมพิวเตอร์ของห้องสมุดเชื่อมต่อผ่าน Wi-Fi แทนการต่อสาย USB-UART</w:t>
       </w:r>
     </w:p>
     <w:p>
@@ -4550,7 +4577,7 @@
         </w:rPr>
         <w:t>2.</w:t>
         <w:tab/>
-        <w:t>ไฟห้องเปลี่ยนจาก LED สีขาว 3 ดวง เป็น 1 ดวง</w:t>
+        <w:t>ไฟห้อง LED สีขาว 3 ดวง ต่อขนานกันและควบคุมด้วยขาเอาต์พุตเพียงขาเดียว</w:t>
       </w:r>
     </w:p>
     <w:p>

</xml_diff>

<commit_message>
Proposal: remove the change summary section
</commit_message>
<xml_diff>
--- a/Proposal_SmartLibrary_updated.docx
+++ b/Proposal_SmartLibrary_updated.docx
@@ -4526,186 +4526,6 @@
         <w:t>แผนการดำเนินงานเป็นแผนเดิมตามข้อเสนอโครงงานฉบับแรก</w:t>
       </w:r>
     </w:p>
-    <w:p>
-      <w:pPr>
-        <w:keepNext/>
-        <w:spacing w:before="280" w:after="80"/>
-        <w:jc w:val="left"/>
-      </w:pPr>
-      <w:r>
-        <w:rPr>
-          <w:rFonts w:ascii="TH Sarabun New" w:hAnsi="TH Sarabun New" w:cs="TH Sarabun New"/>
-          <w:b/>
-          <w:bCs/>
-          <w:sz w:val="36"/>
-          <w:szCs w:val="36"/>
-          <w:cs/>
-        </w:rPr>
-        <w:t>สรุปการปรับปรุงจากข้อเสนอโครงงานฉบับเดิม</w:t>
-      </w:r>
-    </w:p>
-    <w:p>
-      <w:pPr>
-        <w:tabs>
-          <w:tab w:pos="1077" w:val="left"/>
-        </w:tabs>
-        <w:spacing w:after="40"/>
-        <w:ind w:left="1077" w:hanging="369"/>
-        <w:jc w:val="left"/>
-      </w:pPr>
-      <w:r>
-        <w:rPr>
-          <w:rFonts w:ascii="TH Sarabun New" w:hAnsi="TH Sarabun New" w:cs="TH Sarabun New"/>
-        </w:rPr>
-        <w:t>1.</w:t>
-        <w:tab/>
-        <w:t>เว็บไซต์ย้ายมาอยู่บนโมดูล Wi-Fi ESP8266 บนบอร์ด 1 คอมพิวเตอร์ของห้องสมุดเชื่อมต่อผ่าน Wi-Fi แทนการต่อสาย USB-UART</w:t>
-      </w:r>
-    </w:p>
-    <w:p>
-      <w:pPr>
-        <w:tabs>
-          <w:tab w:pos="1077" w:val="left"/>
-        </w:tabs>
-        <w:spacing w:after="40"/>
-        <w:ind w:left="1077" w:hanging="369"/>
-        <w:jc w:val="left"/>
-      </w:pPr>
-      <w:r>
-        <w:rPr>
-          <w:rFonts w:ascii="TH Sarabun New" w:hAnsi="TH Sarabun New" w:cs="TH Sarabun New"/>
-        </w:rPr>
-        <w:t>2.</w:t>
-        <w:tab/>
-        <w:t>ไฟห้อง LED สีขาว 3 ดวง ต่อขนานกันและควบคุมด้วยขาเอาต์พุตเพียงขาเดียว</w:t>
-      </w:r>
-    </w:p>
-    <w:p>
-      <w:pPr>
-        <w:tabs>
-          <w:tab w:pos="1077" w:val="left"/>
-        </w:tabs>
-        <w:spacing w:after="40"/>
-        <w:ind w:left="1077" w:hanging="369"/>
-        <w:jc w:val="left"/>
-      </w:pPr>
-      <w:r>
-        <w:rPr>
-          <w:rFonts w:ascii="TH Sarabun New" w:hAnsi="TH Sarabun New" w:cs="TH Sarabun New"/>
-        </w:rPr>
-        <w:t>3.</w:t>
-        <w:tab/>
-        <w:t>เพิ่มปุ่มกดสลับโหมดไฟ Auto / Manual บนบอร์ด และควบคุมไฟกับพัดลมจากเว็บได้</w:t>
-      </w:r>
-    </w:p>
-    <w:p>
-      <w:pPr>
-        <w:tabs>
-          <w:tab w:pos="1077" w:val="left"/>
-        </w:tabs>
-        <w:spacing w:after="40"/>
-        <w:ind w:left="1077" w:hanging="369"/>
-        <w:jc w:val="left"/>
-      </w:pPr>
-      <w:r>
-        <w:rPr>
-          <w:rFonts w:ascii="TH Sarabun New" w:hAnsi="TH Sarabun New" w:cs="TH Sarabun New"/>
-        </w:rPr>
-        <w:t>4.</w:t>
-        <w:tab/>
-        <w:t>ระบบที่นั่งเปลี่ยนจากสวิตช์ 1 ตัวต่อ 1 โต๊ะ (3 โต๊ะ) เป็นสวิตช์ 3 ตัวแบบเลขฐานสอง รองรับ 7 ที่นั่ง เว็บแสดงเป็นแถบที่นั่ง 7 ช่อง</w:t>
-      </w:r>
-    </w:p>
-    <w:p>
-      <w:pPr>
-        <w:tabs>
-          <w:tab w:pos="1077" w:val="left"/>
-        </w:tabs>
-        <w:spacing w:after="40"/>
-        <w:ind w:left="1077" w:hanging="369"/>
-        <w:jc w:val="left"/>
-      </w:pPr>
-      <w:r>
-        <w:rPr>
-          <w:rFonts w:ascii="TH Sarabun New" w:hAnsi="TH Sarabun New" w:cs="TH Sarabun New"/>
-        </w:rPr>
-        <w:t>5.</w:t>
-        <w:tab/>
-        <w:t>สีโซนเปลี่ยนเป็น แดง น้ำเงิน เขียว และเพิ่มไฟโซน 3 ดวง</w:t>
-      </w:r>
-    </w:p>
-    <w:p>
-      <w:pPr>
-        <w:tabs>
-          <w:tab w:pos="1077" w:val="left"/>
-        </w:tabs>
-        <w:spacing w:after="40"/>
-        <w:ind w:left="1077" w:hanging="369"/>
-        <w:jc w:val="left"/>
-      </w:pPr>
-      <w:r>
-        <w:rPr>
-          <w:rFonts w:ascii="TH Sarabun New" w:hAnsi="TH Sarabun New" w:cs="TH Sarabun New"/>
-        </w:rPr>
-        <w:t>6.</w:t>
-        <w:tab/>
-        <w:t>สีชั้นเปลี่ยนเป็น แดง น้ำเงิน เขียว โดยชั้นสีเขียวใช้ LED สีเหลืองเพื่อให้สว่างขึ้น ส่วนไฟโซนสีเขียวยังใช้ LED สีเขียว</w:t>
-      </w:r>
-    </w:p>
-    <w:p>
-      <w:pPr>
-        <w:tabs>
-          <w:tab w:pos="1077" w:val="left"/>
-        </w:tabs>
-        <w:spacing w:after="40"/>
-        <w:ind w:left="1077" w:hanging="369"/>
-        <w:jc w:val="left"/>
-      </w:pPr>
-      <w:r>
-        <w:rPr>
-          <w:rFonts w:ascii="TH Sarabun New" w:hAnsi="TH Sarabun New" w:cs="TH Sarabun New"/>
-        </w:rPr>
-        <w:t>7.</w:t>
-        <w:tab/>
-        <w:t>หน้าค้นหาแสดงหนังสือทุกเล่มตั้งแต่เปิด และกรองตามคำค้นหา</w:t>
-      </w:r>
-    </w:p>
-    <w:p>
-      <w:pPr>
-        <w:tabs>
-          <w:tab w:pos="1077" w:val="left"/>
-        </w:tabs>
-        <w:spacing w:after="40"/>
-        <w:ind w:left="1077" w:hanging="369"/>
-        <w:jc w:val="left"/>
-      </w:pPr>
-      <w:r>
-        <w:rPr>
-          <w:rFonts w:ascii="TH Sarabun New" w:hAnsi="TH Sarabun New" w:cs="TH Sarabun New"/>
-        </w:rPr>
-        <w:t>8.</w:t>
-        <w:tab/>
-        <w:t>กด Follow แล้ว buzzer เล่นเพลงสั้น และบอร์ด 2 แสดงตำแหน่งโซน-ชั้นบน 7-segment</w:t>
-      </w:r>
-    </w:p>
-    <w:p>
-      <w:pPr>
-        <w:tabs>
-          <w:tab w:pos="1077" w:val="left"/>
-        </w:tabs>
-        <w:spacing w:after="40"/>
-        <w:ind w:left="1077" w:hanging="369"/>
-        <w:jc w:val="left"/>
-      </w:pPr>
-      <w:r>
-        <w:rPr>
-          <w:rFonts w:ascii="TH Sarabun New" w:hAnsi="TH Sarabun New" w:cs="TH Sarabun New"/>
-        </w:rPr>
-        <w:t>9.</w:t>
-        <w:tab/>
-        <w:t>เว็บแจ้งเตือนควันเต็มหน้าจอเมื่อสถานะอันตราย</w:t>
-      </w:r>
-    </w:p>
     <w:sectPr>
       <w:pgSz w:w="11906" w:h="16838"/>
       <w:pgMar w:top="1440" w:right="1440" w:bottom="1440" w:left="1440" w:header="720" w:footer="720" w:gutter="0"/>

</xml_diff>

<commit_message>
Proposal: drop cover subtitle and work-plan note
</commit_message>
<xml_diff>
--- a/Proposal_SmartLibrary_updated.docx
+++ b/Proposal_SmartLibrary_updated.docx
@@ -30,7 +30,7 @@
     </w:p>
     <w:p>
       <w:pPr>
-        <w:spacing w:before="0" w:after="40"/>
+        <w:spacing w:before="0" w:after="280"/>
         <w:jc w:val="center"/>
       </w:pPr>
       <w:r>
@@ -40,21 +40,6 @@
           <w:szCs w:val="32"/>
         </w:rPr>
         <w:t>Digital System Fundamentals Assignment 2569</w:t>
-      </w:r>
-    </w:p>
-    <w:p>
-      <w:pPr>
-        <w:spacing w:before="0" w:after="280"/>
-        <w:jc w:val="center"/>
-      </w:pPr>
-      <w:r>
-        <w:rPr>
-          <w:rFonts w:ascii="TH Sarabun New" w:hAnsi="TH Sarabun New" w:cs="TH Sarabun New"/>
-          <w:sz w:val="28"/>
-          <w:szCs w:val="28"/>
-          <w:cs/>
-        </w:rPr>
-        <w:t>ฉบับปรับปรุงตามชิ้นงานจริง (28 ตุลาคม 2569)</w:t>
       </w:r>
     </w:p>
     <w:p>
@@ -4507,25 +4492,6 @@
         </w:tc>
       </w:tr>
     </w:tbl>
-    <w:p>
-      <w:pPr>
-        <w:keepNext w:val="0"/>
-        <w:spacing w:before="0" w:after="80"/>
-        <w:ind w:left="709"/>
-        <w:jc w:val="left"/>
-      </w:pPr>
-      <w:r>
-        <w:rPr>
-          <w:rFonts w:ascii="TH Sarabun New" w:hAnsi="TH Sarabun New" w:cs="TH Sarabun New"/>
-          <w:i/>
-          <w:iCs/>
-          <w:sz w:val="28"/>
-          <w:szCs w:val="28"/>
-          <w:cs/>
-        </w:rPr>
-        <w:t>แผนการดำเนินงานเป็นแผนเดิมตามข้อเสนอโครงงานฉบับแรก</w:t>
-      </w:r>
-    </w:p>
     <w:sectPr>
       <w:pgSz w:w="11906" w:h="16838"/>
       <w:pgMar w:top="1440" w:right="1440" w:bottom="1440" w:left="1440" w:header="720" w:footer="720" w:gutter="0"/>

</xml_diff>

<commit_message>
Update all docs to current system
- SYSTEM.md: LCD fire message and Yelp siren in smoke system and tests,
  file list now covers proposal, design doc, source folders, alarm preview
- Proposal: LCD fire alarm message and web siren; work plan table kept
  on one page; rebuilt docx/pdf
- Design Document: Word file replaced with the latest build
- design_doc_src/README: current figure names and seal image
</commit_message>
<xml_diff>
--- a/Proposal_SmartLibrary_updated.docx
+++ b/Proposal_SmartLibrary_updated.docx
@@ -697,7 +697,7 @@
         </w:rPr>
         <w:t>•</w:t>
         <w:tab/>
-        <w:t>ตรวจจับควันด้วยเซนเซอร์ MQ-2 แบ่งสถานะเป็นปลอดภัยและอันตราย เมื่ออันตราย buzzer บนบอร์ดจะดังเป็นจังหวะ และเว็บแสดงการแจ้งเตือนเต็มหน้าจอ</w:t>
+        <w:t>ตรวจจับควันด้วยเซนเซอร์ MQ-2 แบ่งสถานะเป็นปลอดภัยและอันตราย เมื่ออันตราย buzzer บนบอร์ดจะดังเป็นจังหวะ จอ LCD แสดงข้อความเตือนไฟไหม้ และเว็บแสดงการแจ้งเตือนเต็มหน้าจอพร้อมเสียงไซเรน</w:t>
       </w:r>
     </w:p>
     <w:p>
@@ -1183,7 +1183,7 @@
         </w:rPr>
         <w:t>•</w:t>
         <w:tab/>
-        <w:t>จอ LCD 16×2 สำหรับแสดงจำนวนที่นั่งว่างและไม่ว่าง</w:t>
+        <w:t>จอ LCD 16×2 สำหรับแสดงจำนวนที่นั่งว่างและไม่ว่าง และข้อความเตือนเมื่อเกิดไฟไหม้</w:t>
       </w:r>
     </w:p>
     <w:p>
@@ -1636,7 +1636,72 @@
           <w:rFonts w:ascii="TH Sarabun New" w:hAnsi="TH Sarabun New" w:cs="TH Sarabun New"/>
           <w:cs/>
         </w:rPr>
-        <w:t xml:space="preserve">บนบอร์ดเป็นจังหวะดัง 0.25 วินาที เงียบ 0.25 วินาที และเว็บแสดงการแจ้งเตือนเต็มหน้าจอพร้อมเวลาที่ตรวจพบล่าสุด</w:t>
+        <w:t xml:space="preserve">บนบอร์ดเป็นจังหวะดัง 0.25 วินาที เงียบ 0.25 วินาที จอ </w:t>
+      </w:r>
+      <w:r>
+        <w:rPr>
+          <w:rFonts w:ascii="TH Sarabun New" w:hAnsi="TH Sarabun New" w:cs="TH Sarabun New"/>
+        </w:rPr>
+        <w:t xml:space="preserve">LCD </w:t>
+      </w:r>
+      <w:r>
+        <w:rPr>
+          <w:rFonts w:ascii="TH Sarabun New" w:hAnsi="TH Sarabun New" w:cs="TH Sarabun New"/>
+          <w:cs/>
+        </w:rPr>
+        <w:t xml:space="preserve">เปลี่ยนจากจำนวนที่นั่งเป็นข้อความ </w:t>
+      </w:r>
+      <w:r>
+        <w:rPr>
+          <w:rFonts w:ascii="TH Sarabun New" w:hAnsi="TH Sarabun New" w:cs="TH Sarabun New"/>
+        </w:rPr>
+        <w:t xml:space="preserve">FIRE ALARM </w:t>
+      </w:r>
+      <w:r>
+        <w:rPr>
+          <w:rFonts w:ascii="TH Sarabun New" w:hAnsi="TH Sarabun New" w:cs="TH Sarabun New"/>
+          <w:cs/>
+        </w:rPr>
+        <w:t xml:space="preserve">และ </w:t>
+      </w:r>
+      <w:r>
+        <w:rPr>
+          <w:rFonts w:ascii="TH Sarabun New" w:hAnsi="TH Sarabun New" w:cs="TH Sarabun New"/>
+        </w:rPr>
+        <w:t xml:space="preserve">EVACUATE NOW </w:t>
+      </w:r>
+      <w:r>
+        <w:rPr>
+          <w:rFonts w:ascii="TH Sarabun New" w:hAnsi="TH Sarabun New" w:cs="TH Sarabun New"/>
+          <w:cs/>
+        </w:rPr>
+        <w:t xml:space="preserve">กะพริบตามจังหวะ </w:t>
+      </w:r>
+      <w:r>
+        <w:rPr>
+          <w:rFonts w:ascii="TH Sarabun New" w:hAnsi="TH Sarabun New" w:cs="TH Sarabun New"/>
+        </w:rPr>
+        <w:t xml:space="preserve">buzzer </w:t>
+      </w:r>
+      <w:r>
+        <w:rPr>
+          <w:rFonts w:ascii="TH Sarabun New" w:hAnsi="TH Sarabun New" w:cs="TH Sarabun New"/>
+          <w:cs/>
+        </w:rPr>
+        <w:t xml:space="preserve">และเว็บแสดงการแจ้งเตือนเต็มหน้าจอพร้อมเสียงไซเรนและเวลาที่ตรวจพบล่าสุด เมื่อควันหาย จอ </w:t>
+      </w:r>
+      <w:r>
+        <w:rPr>
+          <w:rFonts w:ascii="TH Sarabun New" w:hAnsi="TH Sarabun New" w:cs="TH Sarabun New"/>
+        </w:rPr>
+        <w:t xml:space="preserve">LCD </w:t>
+      </w:r>
+      <w:r>
+        <w:rPr>
+          <w:rFonts w:ascii="TH Sarabun New" w:hAnsi="TH Sarabun New" w:cs="TH Sarabun New"/>
+          <w:cs/>
+        </w:rPr>
+        <w:t xml:space="preserve">กลับไปแสดงจำนวนที่นั่งทันที</w:t>
       </w:r>
     </w:p>
     <w:p>
@@ -3067,7 +3132,7 @@
         </w:rPr>
         <w:t>•</w:t>
         <w:tab/>
-        <w:t>แสดงจำนวนที่นั่งว่างและจำนวนที่นั่งไม่ว่าง</w:t>
+        <w:t>แสดงจำนวนที่นั่งว่างและจำนวนที่นั่งไม่ว่าง และแสดงข้อความเตือนไฟไหม้แทนเมื่อตรวจพบควัน</w:t>
       </w:r>
     </w:p>
     <w:p>
@@ -3348,6 +3413,7 @@
           </w:tcPr>
           <w:p>
             <w:pPr>
+              <w:keepNext/>
               <w:jc w:val="left"/>
             </w:pPr>
             <w:r/>
@@ -3370,6 +3436,7 @@
           </w:tcPr>
           <w:p>
             <w:pPr>
+              <w:keepNext/>
               <w:jc w:val="center"/>
             </w:pPr>
             <w:r/>
@@ -3392,6 +3459,7 @@
           </w:tcPr>
           <w:p>
             <w:pPr>
+              <w:keepNext/>
               <w:jc w:val="center"/>
             </w:pPr>
             <w:r/>
@@ -3414,6 +3482,7 @@
           </w:tcPr>
           <w:p>
             <w:pPr>
+              <w:keepNext/>
               <w:jc w:val="center"/>
             </w:pPr>
             <w:r/>
@@ -3436,6 +3505,7 @@
           </w:tcPr>
           <w:p>
             <w:pPr>
+              <w:keepNext/>
               <w:jc w:val="center"/>
             </w:pPr>
             <w:r/>
@@ -3458,6 +3528,7 @@
           </w:tcPr>
           <w:p>
             <w:pPr>
+              <w:keepNext/>
               <w:jc w:val="center"/>
             </w:pPr>
             <w:r/>
@@ -3485,6 +3556,7 @@
           </w:tcPr>
           <w:p>
             <w:pPr>
+              <w:keepNext/>
               <w:jc w:val="left"/>
             </w:pPr>
             <w:r/>
@@ -3506,6 +3578,7 @@
           </w:tcPr>
           <w:p>
             <w:pPr>
+              <w:keepNext/>
               <w:jc w:val="left"/>
             </w:pPr>
             <w:r/>
@@ -3524,6 +3597,7 @@
           </w:tcPr>
           <w:p>
             <w:pPr>
+              <w:keepNext/>
               <w:jc w:val="left"/>
             </w:pPr>
             <w:r/>
@@ -3542,6 +3616,7 @@
           </w:tcPr>
           <w:p>
             <w:pPr>
+              <w:keepNext/>
               <w:jc w:val="left"/>
             </w:pPr>
             <w:r/>
@@ -3560,6 +3635,7 @@
           </w:tcPr>
           <w:p>
             <w:pPr>
+              <w:keepNext/>
               <w:jc w:val="left"/>
             </w:pPr>
             <w:r/>
@@ -3578,6 +3654,7 @@
           </w:tcPr>
           <w:p>
             <w:pPr>
+              <w:keepNext/>
               <w:jc w:val="left"/>
             </w:pPr>
             <w:r/>
@@ -3601,6 +3678,7 @@
           </w:tcPr>
           <w:p>
             <w:pPr>
+              <w:keepNext/>
               <w:jc w:val="left"/>
             </w:pPr>
             <w:r/>
@@ -3646,6 +3724,7 @@
           </w:tcPr>
           <w:p>
             <w:pPr>
+              <w:keepNext/>
               <w:jc w:val="left"/>
             </w:pPr>
             <w:r/>
@@ -3665,6 +3744,7 @@
           </w:tcPr>
           <w:p>
             <w:pPr>
+              <w:keepNext/>
               <w:jc w:val="left"/>
             </w:pPr>
             <w:r/>
@@ -3684,6 +3764,7 @@
           </w:tcPr>
           <w:p>
             <w:pPr>
+              <w:keepNext/>
               <w:jc w:val="left"/>
             </w:pPr>
             <w:r/>
@@ -3702,6 +3783,7 @@
           </w:tcPr>
           <w:p>
             <w:pPr>
+              <w:keepNext/>
               <w:jc w:val="left"/>
             </w:pPr>
             <w:r/>
@@ -3720,6 +3802,7 @@
           </w:tcPr>
           <w:p>
             <w:pPr>
+              <w:keepNext/>
               <w:jc w:val="left"/>
             </w:pPr>
             <w:r/>
@@ -3743,6 +3826,7 @@
           </w:tcPr>
           <w:p>
             <w:pPr>
+              <w:keepNext/>
               <w:jc w:val="left"/>
             </w:pPr>
             <w:r/>
@@ -3788,6 +3872,7 @@
           </w:tcPr>
           <w:p>
             <w:pPr>
+              <w:keepNext/>
               <w:jc w:val="left"/>
             </w:pPr>
             <w:r/>
@@ -3807,6 +3892,7 @@
           </w:tcPr>
           <w:p>
             <w:pPr>
+              <w:keepNext/>
               <w:jc w:val="left"/>
             </w:pPr>
             <w:r/>
@@ -3826,6 +3912,7 @@
           </w:tcPr>
           <w:p>
             <w:pPr>
+              <w:keepNext/>
               <w:jc w:val="left"/>
             </w:pPr>
             <w:r/>
@@ -3844,6 +3931,7 @@
           </w:tcPr>
           <w:p>
             <w:pPr>
+              <w:keepNext/>
               <w:jc w:val="left"/>
             </w:pPr>
             <w:r/>
@@ -3862,6 +3950,7 @@
           </w:tcPr>
           <w:p>
             <w:pPr>
+              <w:keepNext/>
               <w:jc w:val="left"/>
             </w:pPr>
             <w:r/>
@@ -3885,6 +3974,7 @@
           </w:tcPr>
           <w:p>
             <w:pPr>
+              <w:keepNext/>
               <w:jc w:val="left"/>
             </w:pPr>
             <w:r/>
@@ -3905,6 +3995,7 @@
           </w:tcPr>
           <w:p>
             <w:pPr>
+              <w:keepNext/>
               <w:jc w:val="left"/>
             </w:pPr>
             <w:r/>
@@ -3923,6 +4014,7 @@
           </w:tcPr>
           <w:p>
             <w:pPr>
+              <w:keepNext/>
               <w:jc w:val="left"/>
             </w:pPr>
             <w:r/>
@@ -3942,6 +4034,7 @@
           </w:tcPr>
           <w:p>
             <w:pPr>
+              <w:keepNext/>
               <w:jc w:val="left"/>
             </w:pPr>
             <w:r/>
@@ -3961,6 +4054,7 @@
           </w:tcPr>
           <w:p>
             <w:pPr>
+              <w:keepNext/>
               <w:jc w:val="left"/>
             </w:pPr>
             <w:r/>
@@ -3979,6 +4073,7 @@
           </w:tcPr>
           <w:p>
             <w:pPr>
+              <w:keepNext/>
               <w:jc w:val="left"/>
             </w:pPr>
             <w:r/>
@@ -4002,6 +4097,7 @@
           </w:tcPr>
           <w:p>
             <w:pPr>
+              <w:keepNext/>
               <w:jc w:val="left"/>
             </w:pPr>
             <w:r/>
@@ -4039,6 +4135,7 @@
           </w:tcPr>
           <w:p>
             <w:pPr>
+              <w:keepNext/>
               <w:jc w:val="left"/>
             </w:pPr>
             <w:r/>
@@ -4057,6 +4154,7 @@
           </w:tcPr>
           <w:p>
             <w:pPr>
+              <w:keepNext/>
               <w:jc w:val="left"/>
             </w:pPr>
             <w:r/>
@@ -4076,6 +4174,7 @@
           </w:tcPr>
           <w:p>
             <w:pPr>
+              <w:keepNext/>
               <w:jc w:val="left"/>
             </w:pPr>
             <w:r/>
@@ -4095,6 +4194,7 @@
           </w:tcPr>
           <w:p>
             <w:pPr>
+              <w:keepNext/>
               <w:jc w:val="left"/>
             </w:pPr>
             <w:r/>
@@ -4113,6 +4213,7 @@
           </w:tcPr>
           <w:p>
             <w:pPr>
+              <w:keepNext/>
               <w:jc w:val="left"/>
             </w:pPr>
             <w:r/>
@@ -4136,6 +4237,7 @@
           </w:tcPr>
           <w:p>
             <w:pPr>
+              <w:keepNext/>
               <w:jc w:val="left"/>
             </w:pPr>
             <w:r/>
@@ -4156,6 +4258,7 @@
           </w:tcPr>
           <w:p>
             <w:pPr>
+              <w:keepNext/>
               <w:jc w:val="left"/>
             </w:pPr>
             <w:r/>
@@ -4174,6 +4277,7 @@
           </w:tcPr>
           <w:p>
             <w:pPr>
+              <w:keepNext/>
               <w:jc w:val="left"/>
             </w:pPr>
             <w:r/>
@@ -4192,6 +4296,7 @@
           </w:tcPr>
           <w:p>
             <w:pPr>
+              <w:keepNext/>
               <w:jc w:val="left"/>
             </w:pPr>
             <w:r/>
@@ -4211,6 +4316,7 @@
           </w:tcPr>
           <w:p>
             <w:pPr>
+              <w:keepNext/>
               <w:jc w:val="left"/>
             </w:pPr>
             <w:r/>
@@ -4229,6 +4335,7 @@
           </w:tcPr>
           <w:p>
             <w:pPr>
+              <w:keepNext/>
               <w:jc w:val="left"/>
             </w:pPr>
             <w:r/>
@@ -4252,6 +4359,7 @@
           </w:tcPr>
           <w:p>
             <w:pPr>
+              <w:keepNext/>
               <w:jc w:val="left"/>
             </w:pPr>
             <w:r/>
@@ -4272,6 +4380,7 @@
           </w:tcPr>
           <w:p>
             <w:pPr>
+              <w:keepNext/>
               <w:jc w:val="left"/>
             </w:pPr>
             <w:r/>
@@ -4290,6 +4399,7 @@
           </w:tcPr>
           <w:p>
             <w:pPr>
+              <w:keepNext/>
               <w:jc w:val="left"/>
             </w:pPr>
             <w:r/>
@@ -4308,6 +4418,7 @@
           </w:tcPr>
           <w:p>
             <w:pPr>
+              <w:keepNext/>
               <w:jc w:val="left"/>
             </w:pPr>
             <w:r/>
@@ -4326,6 +4437,7 @@
           </w:tcPr>
           <w:p>
             <w:pPr>
+              <w:keepNext/>
               <w:jc w:val="left"/>
             </w:pPr>
             <w:r/>
@@ -4345,6 +4457,7 @@
           </w:tcPr>
           <w:p>
             <w:pPr>
+              <w:keepNext/>
               <w:jc w:val="left"/>
             </w:pPr>
             <w:r/>

</xml_diff>